<commit_message>
docs: clarify place-data contract status
</commit_message>
<xml_diff>
--- a/docs/architecture/Vamo_Data_Acquisition_Strategy.docx
+++ b/docs/architecture/Vamo_Data_Acquisition_Strategy.docx
@@ -190,7 +190,7 @@
                 <w:sz w:val="19"/>
                 <w:szCs w:val="19"/>
               </w:rPr>
-              <w:t xml:space="preserve">Draft for review</w:t>
+              <w:t xml:space="preserve">Architecture contract; current-state gaps stated below</w:t>
             </w:r>
           </w:p>
         </w:tc>
@@ -373,6 +373,37 @@
     </w:p>
     <w:p>
       <w:pPr>
+        <w:pBdr>
+          <w:left w:val="single" w:color="1D5334" w:sz="18" w:space="12"/>
+        </w:pBdr>
+        <w:spacing w:after="160" w:before="140" w:line="276"/>
+        <w:ind w:left="420"/>
+      </w:pPr>
+      <w:r>
+        <w:rPr>
+          <w:b/>
+          <w:bCs/>
+          <w:i/>
+          <w:iCs/>
+          <w:color w:val="1D2A35"/>
+          <w:sz w:val="21"/>
+          <w:szCs w:val="21"/>
+        </w:rPr>
+        <w:t xml:space="preserve">Implementation status, 4 August 2026:</w:t>
+      </w:r>
+      <w:r>
+        <w:rPr>
+          <w:i/>
+          <w:iCs/>
+          <w:color w:val="1D2A35"/>
+          <w:sz w:val="21"/>
+          <w:szCs w:val="21"/>
+        </w:rPr>
+        <w:t xml:space="preserve"> this is an architecture contract, not a claim that every control described below is live. The current place-promotion function still permits a trusted-source bypass or two distinct users, and it does not count distinct days. Device-fix contribution has not been built because its consent design remains open. The status matrix in §1.1 names the other material gaps; every unqualified invariant in §9 is a required target state until its enforcement slice has landed and been verified.</w:t>
+      </w:r>
+    </w:p>
+    <w:p>
+      <w:pPr>
         <w:pStyle w:val="Heading2"/>
         <w:spacing w:after="120" w:before="240"/>
       </w:pPr>
@@ -410,6 +441,504 @@
         </w:rPr>
         <w:t xml:space="preserve">This document states them explicitly so they can be challenged, and defines the rules that follow. If any load-bearing rule in §9 turns out to be wrong, the architecture changes. That is precisely why they are written down rather than held in memory.</w:t>
       </w:r>
+    </w:p>
+    <w:p>
+      <w:pPr>
+        <w:pStyle w:val="Heading2"/>
+        <w:spacing w:after="120" w:before="240"/>
+      </w:pPr>
+      <w:r>
+        <w:rPr>
+          <w:b/>
+          <w:bCs/>
+          <w:color w:val="1D5334"/>
+          <w:sz w:val="24"/>
+          <w:szCs w:val="24"/>
+        </w:rPr>
+        <w:t xml:space="preserve">1.1 Current state and contract</w:t>
+      </w:r>
+    </w:p>
+    <w:tbl>
+      <w:tblPr>
+        <w:tblW w:type="pct" w:w="100%"/>
+        <w:tblBorders>
+          <w:top w:val="single" w:color="auto" w:sz="4"/>
+          <w:left w:val="single" w:color="auto" w:sz="4"/>
+          <w:bottom w:val="single" w:color="auto" w:sz="4"/>
+          <w:right w:val="single" w:color="auto" w:sz="4"/>
+          <w:insideH w:val="single" w:color="auto" w:sz="4"/>
+          <w:insideV w:val="single" w:color="auto" w:sz="4"/>
+        </w:tblBorders>
+      </w:tblPr>
+      <w:tblGrid>
+        <w:gridCol w:w="100"/>
+        <w:gridCol w:w="100"/>
+        <w:gridCol w:w="100"/>
+      </w:tblGrid>
+      <w:tr>
+        <w:trPr>
+          <w:tblHeader/>
+        </w:trPr>
+        <w:tc>
+          <w:tcPr>
+            <w:tcW w:type="pct" w:w="33%"/>
+            <w:shd w:fill="EDF1F5" w:val="clear"/>
+            <w:tcMar>
+              <w:top w:type="dxa" w:w="90"/>
+              <w:left w:type="dxa" w:w="130"/>
+              <w:bottom w:type="dxa" w:w="90"/>
+              <w:right w:type="dxa" w:w="130"/>
+            </w:tcMar>
+          </w:tcPr>
+          <w:p>
+            <w:r>
+              <w:rPr>
+                <w:b/>
+                <w:bCs/>
+                <w:sz w:val="19"/>
+                <w:szCs w:val="19"/>
+              </w:rPr>
+              <w:t xml:space="preserve">Capability</w:t>
+            </w:r>
+          </w:p>
+        </w:tc>
+        <w:tc>
+          <w:tcPr>
+            <w:tcW w:type="pct" w:w="33%"/>
+            <w:shd w:fill="EDF1F5" w:val="clear"/>
+            <w:tcMar>
+              <w:top w:type="dxa" w:w="90"/>
+              <w:left w:type="dxa" w:w="130"/>
+              <w:bottom w:type="dxa" w:w="90"/>
+              <w:right w:type="dxa" w:w="130"/>
+            </w:tcMar>
+          </w:tcPr>
+          <w:p>
+            <w:r>
+              <w:rPr>
+                <w:b/>
+                <w:bCs/>
+                <w:sz w:val="19"/>
+                <w:szCs w:val="19"/>
+              </w:rPr>
+              <w:t xml:space="preserve">Current state</w:t>
+            </w:r>
+          </w:p>
+        </w:tc>
+        <w:tc>
+          <w:tcPr>
+            <w:tcW w:type="pct" w:w="33%"/>
+            <w:shd w:fill="EDF1F5" w:val="clear"/>
+            <w:tcMar>
+              <w:top w:type="dxa" w:w="90"/>
+              <w:left w:type="dxa" w:w="130"/>
+              <w:bottom w:type="dxa" w:w="90"/>
+              <w:right w:type="dxa" w:w="130"/>
+            </w:tcMar>
+          </w:tcPr>
+          <w:p>
+            <w:r>
+              <w:rPr>
+                <w:b/>
+                <w:bCs/>
+                <w:sz w:val="19"/>
+                <w:szCs w:val="19"/>
+              </w:rPr>
+              <w:t xml:space="preserve">Required contract</w:t>
+            </w:r>
+          </w:p>
+        </w:tc>
+      </w:tr>
+      <w:tr>
+        <w:tc>
+          <w:tcPr>
+            <w:tcW w:type="pct" w:w="33%"/>
+            <w:tcMar>
+              <w:top w:type="dxa" w:w="90"/>
+              <w:left w:type="dxa" w:w="130"/>
+              <w:bottom w:type="dxa" w:w="90"/>
+              <w:right w:type="dxa" w:w="130"/>
+            </w:tcMar>
+          </w:tcPr>
+          <w:p>
+            <w:r>
+              <w:rPr>
+                <w:sz w:val="19"/>
+                <w:szCs w:val="19"/>
+              </w:rPr>
+              <w:t xml:space="preserve">Observation promotion</w:t>
+            </w:r>
+          </w:p>
+        </w:tc>
+        <w:tc>
+          <w:tcPr>
+            <w:tcW w:type="pct" w:w="33%"/>
+            <w:tcMar>
+              <w:top w:type="dxa" w:w="90"/>
+              <w:left w:type="dxa" w:w="130"/>
+              <w:bottom w:type="dxa" w:w="90"/>
+              <w:right w:type="dxa" w:w="130"/>
+            </w:tcMar>
+          </w:tcPr>
+          <w:p>
+            <w:r>
+              <w:rPr>
+                <w:sz w:val="19"/>
+                <w:szCs w:val="19"/>
+              </w:rPr>
+              <w:t xml:space="preserve">Legacy </w:t>
+            </w:r>
+            <w:r>
+              <w:rPr>
+                <w:b/>
+                <w:bCs/>
+                <w:sz w:val="19"/>
+                <w:szCs w:val="19"/>
+              </w:rPr>
+              <w:t xml:space="preserve">promote_location_aliases</w:t>
+            </w:r>
+            <w:r>
+              <w:rPr>
+                <w:sz w:val="19"/>
+                <w:szCs w:val="19"/>
+              </w:rPr>
+              <w:t xml:space="preserve"> may promote with </w:t>
+            </w:r>
+            <w:r>
+              <w:rPr>
+                <w:b/>
+                <w:bCs/>
+                <w:sz w:val="19"/>
+                <w:szCs w:val="19"/>
+              </w:rPr>
+              <w:t xml:space="preserve">trusted_source_match</w:t>
+            </w:r>
+            <w:r>
+              <w:rPr>
+                <w:sz w:val="19"/>
+                <w:szCs w:val="19"/>
+              </w:rPr>
+              <w:t xml:space="preserve"> or two distinct users; it does not require distinct days.</w:t>
+            </w:r>
+          </w:p>
+        </w:tc>
+        <w:tc>
+          <w:tcPr>
+            <w:tcW w:type="pct" w:w="33%"/>
+            <w:tcMar>
+              <w:top w:type="dxa" w:w="90"/>
+              <w:left w:type="dxa" w:w="130"/>
+              <w:bottom w:type="dxa" w:w="90"/>
+              <w:right w:type="dxa" w:w="130"/>
+            </w:tcMar>
+          </w:tcPr>
+          <w:p>
+            <w:r>
+              <w:rPr>
+                <w:sz w:val="19"/>
+                <w:szCs w:val="19"/>
+              </w:rPr>
+              <w:t xml:space="preserve">At least 3 distinct users across at least 2 distinct UTC days; no provider-derived bypass.</w:t>
+            </w:r>
+          </w:p>
+        </w:tc>
+      </w:tr>
+      <w:tr>
+        <w:tc>
+          <w:tcPr>
+            <w:tcW w:type="pct" w:w="33%"/>
+            <w:tcMar>
+              <w:top w:type="dxa" w:w="90"/>
+              <w:left w:type="dxa" w:w="130"/>
+              <w:bottom w:type="dxa" w:w="90"/>
+              <w:right w:type="dxa" w:w="130"/>
+            </w:tcMar>
+          </w:tcPr>
+          <w:p>
+            <w:r>
+              <w:rPr>
+                <w:sz w:val="19"/>
+                <w:szCs w:val="19"/>
+              </w:rPr>
+              <w:t xml:space="preserve">Device-fix contribution</w:t>
+            </w:r>
+          </w:p>
+        </w:tc>
+        <w:tc>
+          <w:tcPr>
+            <w:tcW w:type="pct" w:w="33%"/>
+            <w:tcMar>
+              <w:top w:type="dxa" w:w="90"/>
+              <w:left w:type="dxa" w:w="130"/>
+              <w:bottom w:type="dxa" w:w="90"/>
+              <w:right w:type="dxa" w:w="130"/>
+            </w:tcMar>
+          </w:tcPr>
+          <w:p>
+            <w:r>
+              <w:rPr>
+                <w:sz w:val="19"/>
+                <w:szCs w:val="19"/>
+              </w:rPr>
+              <w:t xml:space="preserve">Not implemented. Consent and capture design remain subject to counsel review.</w:t>
+            </w:r>
+          </w:p>
+        </w:tc>
+        <w:tc>
+          <w:tcPr>
+            <w:tcW w:type="pct" w:w="33%"/>
+            <w:tcMar>
+              <w:top w:type="dxa" w:w="90"/>
+              <w:left w:type="dxa" w:w="130"/>
+              <w:bottom w:type="dxa" w:w="90"/>
+              <w:right w:type="dxa" w:w="130"/>
+            </w:tcMar>
+          </w:tcPr>
+          <w:p>
+            <w:r>
+              <w:rPr>
+                <w:sz w:val="19"/>
+                <w:szCs w:val="19"/>
+              </w:rPr>
+              <w:t xml:space="preserve">Separate, declinable consent; use only consented device fixes to derive a canonical coordinate.</w:t>
+            </w:r>
+          </w:p>
+        </w:tc>
+      </w:tr>
+      <w:tr>
+        <w:tc>
+          <w:tcPr>
+            <w:tcW w:type="pct" w:w="33%"/>
+            <w:tcMar>
+              <w:top w:type="dxa" w:w="90"/>
+              <w:left w:type="dxa" w:w="130"/>
+              <w:bottom w:type="dxa" w:w="90"/>
+              <w:right w:type="dxa" w:w="130"/>
+            </w:tcMar>
+          </w:tcPr>
+          <w:p>
+            <w:r>
+              <w:rPr>
+                <w:sz w:val="19"/>
+                <w:szCs w:val="19"/>
+              </w:rPr>
+              <w:t xml:space="preserve">Provider facts on observations</w:t>
+            </w:r>
+          </w:p>
+        </w:tc>
+        <w:tc>
+          <w:tcPr>
+            <w:tcW w:type="pct" w:w="33%"/>
+            <w:tcMar>
+              <w:top w:type="dxa" w:w="90"/>
+              <w:left w:type="dxa" w:w="130"/>
+              <w:bottom w:type="dxa" w:w="90"/>
+              <w:right w:type="dxa" w:w="130"/>
+            </w:tcMar>
+          </w:tcPr>
+          <w:p>
+            <w:r>
+              <w:rPr>
+                <w:b/>
+                <w:bCs/>
+                <w:sz w:val="19"/>
+                <w:szCs w:val="19"/>
+              </w:rPr>
+              <w:t xml:space="preserve">location_source_refs</w:t>
+            </w:r>
+            <w:r>
+              <w:rPr>
+                <w:sz w:val="19"/>
+                <w:szCs w:val="19"/>
+              </w:rPr>
+              <w:t xml:space="preserve"> records canonical provenance. The approved observation-side split is not yet deployed.</w:t>
+            </w:r>
+          </w:p>
+        </w:tc>
+        <w:tc>
+          <w:tcPr>
+            <w:tcW w:type="pct" w:w="33%"/>
+            <w:tcMar>
+              <w:top w:type="dxa" w:w="90"/>
+              <w:left w:type="dxa" w:w="130"/>
+              <w:bottom w:type="dxa" w:w="90"/>
+              <w:right w:type="dxa" w:w="130"/>
+            </w:tcMar>
+          </w:tcPr>
+          <w:p>
+            <w:r>
+              <w:rPr>
+                <w:sz w:val="19"/>
+                <w:szCs w:val="19"/>
+              </w:rPr>
+              <w:t xml:space="preserve">PDA-2 adds expiry-bound </w:t>
+            </w:r>
+            <w:r>
+              <w:rPr>
+                <w:b/>
+                <w:bCs/>
+                <w:sz w:val="19"/>
+                <w:szCs w:val="19"/>
+              </w:rPr>
+              <w:t xml:space="preserve">location_observation_provider_facts</w:t>
+            </w:r>
+            <w:r>
+              <w:rPr>
+                <w:sz w:val="19"/>
+                <w:szCs w:val="19"/>
+              </w:rPr>
+              <w:t xml:space="preserve">; promotion runs as a role with no read grant on that table.</w:t>
+            </w:r>
+          </w:p>
+        </w:tc>
+      </w:tr>
+      <w:tr>
+        <w:tc>
+          <w:tcPr>
+            <w:tcW w:type="pct" w:w="33%"/>
+            <w:tcMar>
+              <w:top w:type="dxa" w:w="90"/>
+              <w:left w:type="dxa" w:w="130"/>
+              <w:bottom w:type="dxa" w:w="90"/>
+              <w:right w:type="dxa" w:w="130"/>
+            </w:tcMar>
+          </w:tcPr>
+          <w:p>
+            <w:r>
+              <w:rPr>
+                <w:sz w:val="19"/>
+                <w:szCs w:val="19"/>
+              </w:rPr>
+              <w:t xml:space="preserve">Confluendo production delivery</w:t>
+            </w:r>
+          </w:p>
+        </w:tc>
+        <w:tc>
+          <w:tcPr>
+            <w:tcW w:type="pct" w:w="33%"/>
+            <w:tcMar>
+              <w:top w:type="dxa" w:w="90"/>
+              <w:left w:type="dxa" w:w="130"/>
+              <w:bottom w:type="dxa" w:w="90"/>
+              <w:right w:type="dxa" w:w="130"/>
+            </w:tcMar>
+          </w:tcPr>
+          <w:p>
+            <w:r>
+              <w:rPr>
+                <w:sz w:val="19"/>
+                <w:szCs w:val="19"/>
+              </w:rPr>
+              <w:t xml:space="preserve">The controlled delivery components exist, but </w:t>
+            </w:r>
+            <w:r>
+              <w:rPr>
+                <w:b/>
+                <w:bCs/>
+                <w:sz w:val="19"/>
+                <w:szCs w:val="19"/>
+              </w:rPr>
+              <w:t xml:space="preserve">productionInboxEnabled</w:t>
+            </w:r>
+            <w:r>
+              <w:rPr>
+                <w:sz w:val="19"/>
+                <w:szCs w:val="19"/>
+              </w:rPr>
+              <w:t xml:space="preserve"> is false in </w:t>
+            </w:r>
+            <w:r>
+              <w:rPr>
+                <w:b/>
+                <w:bCs/>
+                <w:sz w:val="19"/>
+                <w:szCs w:val="19"/>
+              </w:rPr>
+              <w:t xml:space="preserve">bootstrap</w:t>
+            </w:r>
+            <w:r>
+              <w:rPr>
+                <w:sz w:val="19"/>
+                <w:szCs w:val="19"/>
+              </w:rPr>
+              <w:t xml:space="preserve">, </w:t>
+            </w:r>
+            <w:r>
+              <w:rPr>
+                <w:b/>
+                <w:bCs/>
+                <w:sz w:val="19"/>
+                <w:szCs w:val="19"/>
+              </w:rPr>
+              <w:t xml:space="preserve">staging_ramp</w:t>
+            </w:r>
+            <w:r>
+              <w:rPr>
+                <w:sz w:val="19"/>
+                <w:szCs w:val="19"/>
+              </w:rPr>
+              <w:t xml:space="preserve">, and </w:t>
+            </w:r>
+            <w:r>
+              <w:rPr>
+                <w:b/>
+                <w:bCs/>
+                <w:sz w:val="19"/>
+                <w:szCs w:val="19"/>
+              </w:rPr>
+              <w:t xml:space="preserve">volume_ramp</w:t>
+            </w:r>
+            <w:r>
+              <w:rPr>
+                <w:sz w:val="19"/>
+                <w:szCs w:val="19"/>
+              </w:rPr>
+              <w:t xml:space="preserve">. </w:t>
+            </w:r>
+            <w:r>
+              <w:rPr>
+                <w:b/>
+                <w:bCs/>
+                <w:sz w:val="19"/>
+                <w:szCs w:val="19"/>
+              </w:rPr>
+              <w:t xml:space="preserve">steady_state</w:t>
+            </w:r>
+            <w:r>
+              <w:rPr>
+                <w:sz w:val="19"/>
+                <w:szCs w:val="19"/>
+              </w:rPr>
+              <w:t xml:space="preserve"> is currently locked.</w:t>
+            </w:r>
+          </w:p>
+        </w:tc>
+        <w:tc>
+          <w:tcPr>
+            <w:tcW w:type="pct" w:w="33%"/>
+            <w:tcMar>
+              <w:top w:type="dxa" w:w="90"/>
+              <w:left w:type="dxa" w:w="130"/>
+              <w:bottom w:type="dxa" w:w="90"/>
+              <w:right w:type="dxa" w:w="130"/>
+            </w:tcMar>
+          </w:tcPr>
+          <w:p>
+            <w:r>
+              <w:rPr>
+                <w:sz w:val="19"/>
+                <w:szCs w:val="19"/>
+              </w:rPr>
+              <w:t xml:space="preserve">Advance through the three controlled promotions only after the consumer persistence receipt and its evidence are proven.</w:t>
+            </w:r>
+          </w:p>
+        </w:tc>
+      </w:tr>
+    </w:tbl>
+    <w:p>
+      <w:pPr>
+        <w:spacing w:after="120"/>
+      </w:pPr>
     </w:p>
     <w:p>
       <w:pPr>
@@ -1204,7 +1733,23 @@
           <w:sz w:val="21"/>
           <w:szCs w:val="21"/>
         </w:rPr>
-        <w:t xml:space="preserve"> already models this; it must remain authoritative rather than decorative. Without that separation, every row would have to be treated at the most restrictive level of any fact inside it.</w:t>
+        <w:t xml:space="preserve"> records canonical provenance today. The approved PDA-2 observation-side split adds expiry-bound </w:t>
+      </w:r>
+      <w:r>
+        <w:rPr>
+          <w:b/>
+          <w:bCs/>
+          <w:sz w:val="21"/>
+          <w:szCs w:val="21"/>
+        </w:rPr>
+        <w:t xml:space="preserve">location_observation_provider_facts</w:t>
+      </w:r>
+      <w:r>
+        <w:rPr>
+          <w:sz w:val="21"/>
+          <w:szCs w:val="21"/>
+        </w:rPr>
+        <w:t xml:space="preserve"> for provider-derived observation facts. Together, those stores must remain authoritative rather than decorative. Without that separation, every row would have to be treated at the most restrictive level of any fact inside it.</w:t>
       </w:r>
     </w:p>
     <w:p>
@@ -1571,6 +2116,139 @@
       </w:pPr>
       <w:r>
         <w:rPr>
+          <w:b/>
+          <w:bCs/>
+          <w:sz w:val="21"/>
+          <w:szCs w:val="21"/>
+        </w:rPr>
+        <w:t xml:space="preserve">Delivery ceiling today:</w:t>
+      </w:r>
+      <w:r>
+        <w:rPr>
+          <w:sz w:val="21"/>
+          <w:szCs w:val="21"/>
+        </w:rPr>
+        <w:t xml:space="preserve"> </w:t>
+      </w:r>
+      <w:r>
+        <w:rPr>
+          <w:b/>
+          <w:bCs/>
+          <w:sz w:val="21"/>
+          <w:szCs w:val="21"/>
+        </w:rPr>
+        <w:t xml:space="preserve">productionInboxEnabled</w:t>
+      </w:r>
+      <w:r>
+        <w:rPr>
+          <w:sz w:val="21"/>
+          <w:szCs w:val="21"/>
+        </w:rPr>
+        <w:t xml:space="preserve"> remains false in </w:t>
+      </w:r>
+      <w:r>
+        <w:rPr>
+          <w:b/>
+          <w:bCs/>
+          <w:sz w:val="21"/>
+          <w:szCs w:val="21"/>
+        </w:rPr>
+        <w:t xml:space="preserve">bootstrap</w:t>
+      </w:r>
+      <w:r>
+        <w:rPr>
+          <w:sz w:val="21"/>
+          <w:szCs w:val="21"/>
+        </w:rPr>
+        <w:t xml:space="preserve">, </w:t>
+      </w:r>
+      <w:r>
+        <w:rPr>
+          <w:b/>
+          <w:bCs/>
+          <w:sz w:val="21"/>
+          <w:szCs w:val="21"/>
+        </w:rPr>
+        <w:t xml:space="preserve">staging_ramp</w:t>
+      </w:r>
+      <w:r>
+        <w:rPr>
+          <w:sz w:val="21"/>
+          <w:szCs w:val="21"/>
+        </w:rPr>
+        <w:t xml:space="preserve">, and </w:t>
+      </w:r>
+      <w:r>
+        <w:rPr>
+          <w:b/>
+          <w:bCs/>
+          <w:sz w:val="21"/>
+          <w:szCs w:val="21"/>
+        </w:rPr>
+        <w:t xml:space="preserve">volume_ramp</w:t>
+      </w:r>
+      <w:r>
+        <w:rPr>
+          <w:sz w:val="21"/>
+          <w:szCs w:val="21"/>
+        </w:rPr>
+        <w:t xml:space="preserve">; it becomes true only in </w:t>
+      </w:r>
+      <w:r>
+        <w:rPr>
+          <w:b/>
+          <w:bCs/>
+          <w:sz w:val="21"/>
+          <w:szCs w:val="21"/>
+        </w:rPr>
+        <w:t xml:space="preserve">steady_state</w:t>
+      </w:r>
+      <w:r>
+        <w:rPr>
+          <w:sz w:val="21"/>
+          <w:szCs w:val="21"/>
+        </w:rPr>
+        <w:t xml:space="preserve">. The transition from </w:t>
+      </w:r>
+      <w:r>
+        <w:rPr>
+          <w:b/>
+          <w:bCs/>
+          <w:sz w:val="21"/>
+          <w:szCs w:val="21"/>
+        </w:rPr>
+        <w:t xml:space="preserve">volume_ramp</w:t>
+      </w:r>
+      <w:r>
+        <w:rPr>
+          <w:sz w:val="21"/>
+          <w:szCs w:val="21"/>
+        </w:rPr>
+        <w:t xml:space="preserve"> to </w:t>
+      </w:r>
+      <w:r>
+        <w:rPr>
+          <w:b/>
+          <w:bCs/>
+          <w:sz w:val="21"/>
+          <w:szCs w:val="21"/>
+        </w:rPr>
+        <w:t xml:space="preserve">steady_state</w:t>
+      </w:r>
+      <w:r>
+        <w:rPr>
+          <w:sz w:val="21"/>
+          <w:szCs w:val="21"/>
+        </w:rPr>
+        <w:t xml:space="preserve"> is deliberately locked until a production-handoff slice enables it. The three controlled promotions, the consumer persistence receipt, and the telemetry derived from that receipt are therefore prerequisites to routine Layer 1 delivery — not background implementation detail.</w:t>
+      </w:r>
+    </w:p>
+    <w:p>
+      <w:pPr>
+        <w:spacing w:after="140" w:line="276"/>
+      </w:pPr>
+      <w:r>
+        <w:rPr>
           <w:sz w:val="21"/>
           <w:szCs w:val="21"/>
         </w:rPr>
@@ -1890,7 +2568,7 @@
           <w:sz w:val="22"/>
           <w:szCs w:val="22"/>
         </w:rPr>
-        <w:t xml:space="preserve">The corroboration gate</w:t>
+        <w:t xml:space="preserve">The corroboration gate — target contract</w:t>
       </w:r>
     </w:p>
     <w:p>
@@ -1902,16 +2580,32 @@
           <w:sz w:val="21"/>
           <w:szCs w:val="21"/>
         </w:rPr>
-        <w:t xml:space="preserve">Individual traces are never promoted. A fact enters the canonical graph only when </w:t>
-      </w:r>
-      <w:r>
-        <w:rPr>
-          <w:b/>
-          <w:bCs/>
-          <w:sz w:val="21"/>
-          <w:szCs w:val="21"/>
-        </w:rPr>
-        <w:t xml:space="preserve">k ≥ 3 distinct users on distinct days</w:t>
+        <w:t xml:space="preserve">This is </w:t>
+      </w:r>
+      <w:r>
+        <w:rPr>
+          <w:b/>
+          <w:bCs/>
+          <w:sz w:val="21"/>
+          <w:szCs w:val="21"/>
+        </w:rPr>
+        <w:t xml:space="preserve">not current system behaviour</w:t>
+      </w:r>
+      <w:r>
+        <w:rPr>
+          <w:sz w:val="21"/>
+          <w:szCs w:val="21"/>
+        </w:rPr>
+        <w:t xml:space="preserve">. Under the target contract, individual traces are never promoted. A fact may enter the canonical graph only when </w:t>
+      </w:r>
+      <w:r>
+        <w:rPr>
+          <w:b/>
+          <w:bCs/>
+          <w:sz w:val="21"/>
+          <w:szCs w:val="21"/>
+        </w:rPr>
+        <w:t xml:space="preserve">at least 3 distinct users across at least 2 distinct UTC days</w:t>
       </w:r>
       <w:r>
         <w:rPr>
@@ -2061,7 +2755,7 @@
           <w:sz w:val="21"/>
           <w:szCs w:val="21"/>
         </w:rPr>
-        <w:t xml:space="preserve">the canonical coordinate must be computed from device fixes — the median of corroborating observations — and never copied from a provider response field.</w:t>
+        <w:t xml:space="preserve">the canonical coordinate must be computed from consented device fixes — the median of corroborating observations — and never copied from a provider response field.</w:t>
       </w:r>
       <w:r>
         <w:rPr>
@@ -2089,7 +2783,7 @@
           <w:sz w:val="21"/>
           <w:szCs w:val="21"/>
         </w:rPr>
-        <w:t xml:space="preserve">the promotion job should have no read access to provider payload columns.</w:t>
+        <w:t xml:space="preserve">the target `vamo_place_promotion` role has no read grant on `location_observation_provider_facts`.</w:t>
       </w:r>
       <w:r>
         <w:rPr>
@@ -2420,7 +3114,7 @@
           <w:sz w:val="21"/>
           <w:szCs w:val="21"/>
         </w:rPr>
-        <w:t xml:space="preserve">These are the invariants. If one is violated the strategy does not hold. Each should be enforceable in code or CI rather than by memory.</w:t>
+        <w:t xml:space="preserve">These are the required target invariants. If one is violated the strategy does not hold. Each should be enforceable in code or CI rather than by memory; §1.1 identifies those not yet enforced.</w:t>
       </w:r>
     </w:p>
     <w:p>
@@ -2443,7 +3137,7 @@
           <w:sz w:val="21"/>
           <w:szCs w:val="21"/>
         </w:rPr>
-        <w:t xml:space="preserve">The canonical coordinate is computed from device fixes. It is never copied from a provider response.</w:t>
+        <w:t xml:space="preserve">The canonical coordinate is computed from consented device fixes. It is never copied from a provider response.</w:t>
       </w:r>
     </w:p>
     <w:p>
@@ -2466,7 +3160,7 @@
           <w:sz w:val="21"/>
           <w:szCs w:val="21"/>
         </w:rPr>
-        <w:t xml:space="preserve">Promotion to canonical requires k ≥ 3 distinct users on distinct days. Raw traces are dropped at promotion.</w:t>
+        <w:t xml:space="preserve">Promotion to canonical requires at least 3 distinct users across at least 2 distinct UTC days. Raw traces are dropped at promotion.</w:t>
       </w:r>
     </w:p>
     <w:p>
@@ -2732,14 +3426,14 @@
           <w:sz w:val="21"/>
           <w:szCs w:val="21"/>
         </w:rPr>
-        <w:t xml:space="preserve">The exact terms of the commercial Places API endpoints we call today</w:t>
-      </w:r>
-      <w:r>
-        <w:rPr>
-          <w:sz w:val="21"/>
-          <w:szCs w:val="21"/>
-        </w:rPr>
-        <w:t xml:space="preserve"> — particularly the photo endpoints used by </w:t>
+        <w:t xml:space="preserve">The exact terms of the commercial Places API product we call today.</w:t>
+      </w:r>
+      <w:r>
+        <w:rPr>
+          <w:sz w:val="21"/>
+          <w:szCs w:val="21"/>
+        </w:rPr>
+        <w:t xml:space="preserve"> </w:t>
       </w:r>
       <w:r>
         <w:rPr>
@@ -2755,7 +3449,55 @@
           <w:sz w:val="21"/>
           <w:szCs w:val="21"/>
         </w:rPr>
-        <w:t xml:space="preserve">. Caching window, identifier retention, and the precise wording of the anti-database clause.</w:t>
+        <w:t xml:space="preserve"> calls Foursquare </w:t>
+      </w:r>
+      <w:r>
+        <w:rPr>
+          <w:b/>
+          <w:bCs/>
+          <w:sz w:val="21"/>
+          <w:szCs w:val="21"/>
+        </w:rPr>
+        <w:t xml:space="preserve">/places/search</w:t>
+      </w:r>
+      <w:r>
+        <w:rPr>
+          <w:sz w:val="21"/>
+          <w:szCs w:val="21"/>
+        </w:rPr>
+        <w:t xml:space="preserve"> with the </w:t>
+      </w:r>
+      <w:r>
+        <w:rPr>
+          <w:b/>
+          <w:bCs/>
+          <w:sz w:val="21"/>
+          <w:szCs w:val="21"/>
+        </w:rPr>
+        <w:t xml:space="preserve">photos</w:t>
+      </w:r>
+      <w:r>
+        <w:rPr>
+          <w:sz w:val="21"/>
+          <w:szCs w:val="21"/>
+        </w:rPr>
+        <w:t xml:space="preserve"> field; it does not call the separate </w:t>
+      </w:r>
+      <w:r>
+        <w:rPr>
+          <w:b/>
+          <w:bCs/>
+          <w:sz w:val="21"/>
+          <w:szCs w:val="21"/>
+        </w:rPr>
+        <w:t xml:space="preserve">/places/{id}/photos</w:t>
+      </w:r>
+      <w:r>
+        <w:rPr>
+          <w:sz w:val="21"/>
+          <w:szCs w:val="21"/>
+        </w:rPr>
+        <w:t xml:space="preserve"> endpoint. Caching window, identifier retention, and the precise wording of the anti-database clause remain open.</w:t>
       </w:r>
     </w:p>
     <w:p>

</xml_diff>

<commit_message>
fix(ingestion): attest Vamo consumer environment
</commit_message>
<xml_diff>
--- a/docs/architecture/Vamo_Data_Acquisition_Strategy.docx
+++ b/docs/architecture/Vamo_Data_Acquisition_Strategy.docx
@@ -829,7 +829,7 @@
                 <w:sz w:val="19"/>
                 <w:szCs w:val="19"/>
               </w:rPr>
-              <w:t xml:space="preserve">The controlled delivery components exist, but </w:t>
+              <w:t xml:space="preserve">Receipt enforcement is merged in Confluendo, but Vamo has not yet configured its database-owned environment identity. </w:t>
             </w:r>
             <w:r>
               <w:rPr>
@@ -893,7 +893,7 @@
                 <w:sz w:val="19"/>
                 <w:szCs w:val="19"/>
               </w:rPr>
-              <w:t xml:space="preserve">. </w:t>
+              <w:t xml:space="preserve">; </w:t>
             </w:r>
             <w:r>
               <w:rPr>
@@ -929,7 +929,7 @@
                 <w:sz w:val="19"/>
                 <w:szCs w:val="19"/>
               </w:rPr>
-              <w:t xml:space="preserve">Advance through the three controlled promotions only after the consumer persistence receipt and its evidence are proven.</w:t>
+              <w:t xml:space="preserve">Configure and verify the Vamo marker in both databases; worker-configured expected environments must match it before any consumer write, then advance through the three controlled promotions only after consumer persistence evidence is proven.</w:t>
             </w:r>
           </w:p>
         </w:tc>
@@ -2332,7 +2332,7 @@
           <w:sz w:val="21"/>
           <w:szCs w:val="21"/>
         </w:rPr>
-        <w:t xml:space="preserve"> computed by the consumer, in the consumer's database, and read back from it — target identity, package ID, persisted row count, content hash. This is the currently open P0.</w:t>
+        <w:t xml:space="preserve"> computed by the consumer, in the consumer's database, and read back from it — target identity, package ID, persisted row count, content hash. Confluendo receipt enforcement is merged; Vamo environment identity configuration and the independently configured worker-environment match remain the current P0 gate.</w:t>
       </w:r>
     </w:p>
     <w:p>
@@ -2365,6 +2365,225 @@
           <w:szCs w:val="21"/>
         </w:rPr>
         <w:t xml:space="preserve"> fed by the demand signal described in §7.</w:t>
+      </w:r>
+    </w:p>
+    <w:p>
+      <w:pPr>
+        <w:pStyle w:val="Heading3"/>
+        <w:spacing w:after="120" w:before="240"/>
+      </w:pPr>
+      <w:r>
+        <w:rPr>
+          <w:b/>
+          <w:bCs/>
+          <w:color w:val="1D5334"/>
+          <w:sz w:val="22"/>
+          <w:szCs w:val="22"/>
+        </w:rPr>
+        <w:t xml:space="preserve">Data Foundation execution order</w:t>
+      </w:r>
+    </w:p>
+    <w:p>
+      <w:pPr>
+        <w:spacing w:after="140" w:line="276"/>
+      </w:pPr>
+      <w:r>
+        <w:rPr>
+          <w:sz w:val="21"/>
+          <w:szCs w:val="21"/>
+        </w:rPr>
+        <w:t xml:space="preserve">The next Vamo programme is data foundation, not another provider integration in the consumer:</w:t>
+      </w:r>
+    </w:p>
+    <w:p>
+      <w:pPr>
+        <w:spacing w:after="100" w:line="276"/>
+        <w:ind w:left="420" w:hanging="300"/>
+      </w:pPr>
+      <w:r>
+        <w:rPr>
+          <w:b/>
+          <w:bCs/>
+          <w:color w:val="B3261E"/>
+          <w:sz w:val="21"/>
+          <w:szCs w:val="21"/>
+        </w:rPr>
+        <w:t xml:space="preserve">1.  </w:t>
+      </w:r>
+      <w:r>
+        <w:rPr>
+          <w:sz w:val="21"/>
+          <w:szCs w:val="21"/>
+        </w:rPr>
+        <w:t xml:space="preserve">Configure the Vamo Staging and Production receipt identities and prove the consumer-owned apply receipt against each intended database.</w:t>
+      </w:r>
+    </w:p>
+    <w:p>
+      <w:pPr>
+        <w:spacing w:after="100" w:line="276"/>
+        <w:ind w:left="420" w:hanging="300"/>
+      </w:pPr>
+      <w:r>
+        <w:rPr>
+          <w:b/>
+          <w:bCs/>
+          <w:color w:val="B3261E"/>
+          <w:sz w:val="21"/>
+          <w:szCs w:val="21"/>
+        </w:rPr>
+        <w:t xml:space="preserve">2.  </w:t>
+      </w:r>
+      <w:r>
+        <w:rPr>
+          <w:sz w:val="21"/>
+          <w:szCs w:val="21"/>
+        </w:rPr>
+        <w:t xml:space="preserve">Define an </w:t>
+      </w:r>
+      <w:r>
+        <w:rPr>
+          <w:b/>
+          <w:bCs/>
+          <w:sz w:val="21"/>
+          <w:szCs w:val="21"/>
+        </w:rPr>
+        <w:t xml:space="preserve">administrative-reference</w:t>
+      </w:r>
+      <w:r>
+        <w:rPr>
+          <w:sz w:val="21"/>
+          <w:szCs w:val="21"/>
+        </w:rPr>
+        <w:t xml:space="preserve"> artifact contract in Confluendo: stable municipality identity, canonical label, aliases, country and parent codes, centroid, source identifier, dataset version, licence, attribution, and validity period.</w:t>
+      </w:r>
+    </w:p>
+    <w:p>
+      <w:pPr>
+        <w:spacing w:after="100" w:line="276"/>
+        <w:ind w:left="420" w:hanging="300"/>
+      </w:pPr>
+      <w:r>
+        <w:rPr>
+          <w:b/>
+          <w:bCs/>
+          <w:color w:val="B3261E"/>
+          <w:sz w:val="21"/>
+          <w:szCs w:val="21"/>
+        </w:rPr>
+        <w:t xml:space="preserve">3.  </w:t>
+      </w:r>
+      <w:r>
+        <w:rPr>
+          <w:sz w:val="21"/>
+          <w:szCs w:val="21"/>
+        </w:rPr>
+        <w:t xml:space="preserve">Add </w:t>
+      </w:r>
+      <w:r>
+        <w:rPr>
+          <w:b/>
+          <w:bCs/>
+          <w:sz w:val="21"/>
+          <w:szCs w:val="21"/>
+        </w:rPr>
+        <w:t xml:space="preserve">municipality</w:t>
+      </w:r>
+      <w:r>
+        <w:rPr>
+          <w:sz w:val="21"/>
+          <w:szCs w:val="21"/>
+        </w:rPr>
+        <w:t xml:space="preserve"> as an explicit Vamo canonical feature type and map the approved contract into </w:t>
+      </w:r>
+      <w:r>
+        <w:rPr>
+          <w:b/>
+          <w:bCs/>
+          <w:sz w:val="21"/>
+          <w:szCs w:val="21"/>
+        </w:rPr>
+        <w:t xml:space="preserve">location_canonicals</w:t>
+      </w:r>
+      <w:r>
+        <w:rPr>
+          <w:sz w:val="21"/>
+          <w:szCs w:val="21"/>
+        </w:rPr>
+        <w:t xml:space="preserve"> and </w:t>
+      </w:r>
+      <w:r>
+        <w:rPr>
+          <w:b/>
+          <w:bCs/>
+          <w:sz w:val="21"/>
+          <w:szCs w:val="21"/>
+        </w:rPr>
+        <w:t xml:space="preserve">location_source_refs</w:t>
+      </w:r>
+      <w:r>
+        <w:rPr>
+          <w:sz w:val="21"/>
+          <w:szCs w:val="21"/>
+        </w:rPr>
+        <w:t xml:space="preserve">.</w:t>
+      </w:r>
+    </w:p>
+    <w:p>
+      <w:pPr>
+        <w:spacing w:after="100" w:line="276"/>
+        <w:ind w:left="420" w:hanging="300"/>
+      </w:pPr>
+      <w:r>
+        <w:rPr>
+          <w:b/>
+          <w:bCs/>
+          <w:color w:val="B3261E"/>
+          <w:sz w:val="21"/>
+          <w:szCs w:val="21"/>
+        </w:rPr>
+        <w:t xml:space="preserve">4.  </w:t>
+      </w:r>
+      <w:r>
+        <w:rPr>
+          <w:sz w:val="21"/>
+          <w:szCs w:val="21"/>
+        </w:rPr>
+        <w:t xml:space="preserve">Run one bounded Italy release through the governed artifact, Staging verification, consumer inbox, and consumer receipt path; then expand the municipality baseline across the EU in versioned releases.</w:t>
+      </w:r>
+    </w:p>
+    <w:p>
+      <w:pPr>
+        <w:spacing w:after="100" w:line="276"/>
+        <w:ind w:left="420" w:hanging="300"/>
+      </w:pPr>
+      <w:r>
+        <w:rPr>
+          <w:b/>
+          <w:bCs/>
+          <w:color w:val="B3261E"/>
+          <w:sz w:val="21"/>
+          <w:szCs w:val="21"/>
+        </w:rPr>
+        <w:t xml:space="preserve">5.  </w:t>
+      </w:r>
+      <w:r>
+        <w:rPr>
+          <w:sz w:val="21"/>
+          <w:szCs w:val="21"/>
+        </w:rPr>
+        <w:t xml:space="preserve">Add FSQ OS POIs progressively by country and category through Confluendo. A visual is optional, rights-bound cache data; it is not a baseline requirement for every municipality record.</w:t>
+      </w:r>
+    </w:p>
+    <w:p>
+      <w:pPr>
+        <w:spacing w:after="140" w:line="276"/>
+      </w:pPr>
+      <w:r>
+        <w:rPr>
+          <w:sz w:val="21"/>
+          <w:szCs w:val="21"/>
+        </w:rPr>
+        <w:t xml:space="preserve">PDA-1 may proceed in parallel with steps 1–2. PDA-2 and PDA-3 remain separate enforcement work; neither justifies a Vamo-side source loader.</w:t>
       </w:r>
     </w:p>
     <w:p>

</xml_diff>